<commit_message>
feat(carafood): rebrand to CaraFood with Caragua wave emblem, 2-tier 53-bairros explorer, Coucou 60fps Jacquin animations, and 3-month UX roadmap
</commit_message>
<xml_diff>
--- a/docs/academic/APSII_S02_CARAGUA_FOODTECH.docx
+++ b/docs/academic/APSII_S02_CARAGUA_FOODTECH.docx
@@ -44,7 +44,7 @@
         <w:br/>
         <w:t>RELATÓRIO TÉCNICO &amp; MEMORIAL DESCRITIVO DE ENGENHARIA DE SOFTWARE</w:t>
         <w:br/>
-        <w:t>PROJETO: CARAGUÁ FOODTECH</w:t>
+        <w:t>PROJETO: CARÁFOOD</w:t>
         <w:br/>
       </w:r>
       <w:r>
@@ -85,7 +85,7 @@
         <w:t xml:space="preserve">Nome do Sistema: </w:t>
       </w:r>
       <w:r>
-        <w:t>Caraguá FoodTech — Plataforma de Inteligência Gastronômica &amp; Roteiro dos 53 Bairros de Caraguatatuba</w:t>
+        <w:t>CaráFood — Plataforma de Inteligência Gastronômica &amp; Roteiro dos 53 Bairros de Caraguatatuba</w:t>
         <w:br/>
       </w:r>
       <w:r>

</xml_diff>